<commit_message>
update check motion lv1
</commit_message>
<xml_diff>
--- a/Idea_V1.docx
+++ b/Idea_V1.docx
@@ -125,10 +125,25 @@
         <w:t xml:space="preserve">   + </w:t>
       </w:r>
       <w:r>
-        <w:t>Xe 4 bánh cở lớn (container, bus, …)</w:t>
+        <w:t>Xe 4 bánh cở lớn (container</w:t>
+      </w:r>
+      <w:r>
+        <w:t xml:space="preserve"> </w:t>
+      </w:r>
+      <w:r>
+        <w:t>, …)</w:t>
       </w:r>
       <w:r>
         <w:t>.</w:t>
+      </w:r>
+    </w:p>
+    <w:p>
+      <w:pPr>
+        <w:spacing w:after="0"/>
+        <w:jc w:val="both"/>
+      </w:pPr>
+      <w:r>
+        <w:t xml:space="preserve">   + Xe khách (bus, …)</w:t>
       </w:r>
     </w:p>
     <w:p>
@@ -475,6 +490,7 @@
         <w:rPr>
           <w:color w:val="00B0F0"/>
         </w:rPr>
+        <w:lastRenderedPageBreak/>
         <w:t xml:space="preserve">   + List_Checker – Danh sách checker mảng 2 chiều (dùng mảng chứa thông tin</w:t>
       </w:r>
       <w:r>
@@ -1137,6 +1153,9 @@
       <w:r>
         <w:t>Đi Ngược Chiều</w:t>
       </w:r>
+      <w:r>
+        <w:t xml:space="preserve"> - 0</w:t>
+      </w:r>
     </w:p>
     <w:p>
       <w:pPr>
@@ -1171,7 +1190,16 @@
         <w:jc w:val="both"/>
       </w:pPr>
       <w:r>
-        <w:t>Phóng nhanh</w:t>
+        <w:t>Lấn làn</w:t>
+      </w:r>
+      <w:r>
+        <w:t xml:space="preserve">, </w:t>
+      </w:r>
+      <w:r>
+        <w:t>Leo lề</w:t>
+      </w:r>
+      <w:r>
+        <w:t xml:space="preserve"> - 1</w:t>
       </w:r>
     </w:p>
     <w:p>
@@ -1183,10 +1211,10 @@
         <w:t xml:space="preserve">+ </w:t>
       </w:r>
       <w:r>
-        <w:t xml:space="preserve">Khoảng cách </w:t>
-      </w:r>
-      <w:r>
-        <w:t>giữa 2 vị trí quá dài so với bounding box của Char, lúc này phải quy chiều vector được tạo từ 2 vị trí về trị Ox hoặc Oy (ý tưởng là so bằng góc, góc tạo với trục nào bé hơn thì lấy).</w:t>
+        <w:t>Kind của Char không nằm trong danh sách của Checker cho phép</w:t>
+      </w:r>
+      <w:r>
+        <w:t xml:space="preserve"> (ở đây cần lưu ý Char có label là người)</w:t>
       </w:r>
     </w:p>
     <w:p>
@@ -1210,22 +1238,16 @@
         <w:jc w:val="both"/>
       </w:pPr>
       <w:r>
-        <w:t>Lấn làn</w:t>
-      </w:r>
-    </w:p>
-    <w:p>
-      <w:pPr>
-        <w:spacing w:after="0"/>
-        <w:jc w:val="both"/>
-      </w:pPr>
-      <w:r>
-        <w:t xml:space="preserve">+ </w:t>
-      </w:r>
-      <w:r>
-        <w:t>Kind của Char không nằm trong danh sách của Checker cho phép</w:t>
-      </w:r>
-      <w:r>
-        <w:t xml:space="preserve"> (ở đây cần lưu ý Char có label là người)</w:t>
+        <w:t>Lạn Lách (Nếu được)</w:t>
+      </w:r>
+    </w:p>
+    <w:p>
+      <w:pPr>
+        <w:spacing w:after="0"/>
+        <w:jc w:val="both"/>
+      </w:pPr>
+      <w:r>
+        <w:t>+ Ý tưởng là nếu đã phóng nhanh và sự thay đổi góc khá lớn (cần thì có thể thêm biến hướng di chuyển của char từ ảnh trước).</w:t>
       </w:r>
     </w:p>
     <w:p>
@@ -1249,52 +1271,12 @@
         <w:jc w:val="both"/>
       </w:pPr>
       <w:r>
-        <w:t>Lạn Lách (Nếu được)</w:t>
-      </w:r>
-    </w:p>
-    <w:p>
-      <w:pPr>
-        <w:pBdr>
-          <w:bottom w:val="single" w:sz="6" w:space="1" w:color="auto"/>
-        </w:pBdr>
-        <w:spacing w:after="0"/>
-        <w:jc w:val="both"/>
-      </w:pPr>
-      <w:r>
-        <w:t>+ Ý tưởng là nếu đã phóng nhanh và sự thay đổi góc khá lớn (cần thì có thể thêm biến hướng di chuyển của char từ ảnh trước).</w:t>
-      </w:r>
-    </w:p>
-    <w:p>
-      <w:pPr>
-        <w:pBdr>
-          <w:bottom w:val="single" w:sz="6" w:space="1" w:color="auto"/>
-        </w:pBdr>
-        <w:spacing w:after="0"/>
-        <w:jc w:val="both"/>
-      </w:pPr>
-    </w:p>
-    <w:p>
-      <w:pPr>
-        <w:spacing w:after="0"/>
-        <w:jc w:val="both"/>
-      </w:pPr>
-    </w:p>
-    <w:p>
-      <w:pPr>
-        <w:spacing w:after="0"/>
-        <w:jc w:val="both"/>
-      </w:pPr>
-      <w:r>
-        <w:t>Leo lề</w:t>
-      </w:r>
-    </w:p>
-    <w:p>
-      <w:pPr>
-        <w:spacing w:after="0"/>
-        <w:jc w:val="both"/>
-      </w:pPr>
-      <w:r>
-        <w:t>+ Khi các nhãn về phương tiện giao thông vào vùng checker không hoạt động.</w:t>
+        <w:t>Phóng nhanh</w:t>
+      </w:r>
+    </w:p>
+    <w:p>
+      <w:r>
+        <w:t>+ Khoảng cách giữa 2 vị trí quá dài so với bounding box của Char, lúc này phải quy chiều vector được tạo từ 2 vị trí về trị Ox hoặc Oy (ý tưởng là so bằng góc, góc tạo với trục nào bé hơn thì lấy).</w:t>
       </w:r>
     </w:p>
     <w:p>
@@ -1302,13 +1284,13 @@
         <w:br w:type="page"/>
       </w:r>
     </w:p>
-    <w:p>
-      <w:pPr>
-        <w:spacing w:after="0"/>
-        <w:jc w:val="both"/>
-      </w:pPr>
-      <w:r>
-        <w:lastRenderedPageBreak/>
+    <w:p/>
+    <w:p>
+      <w:pPr>
+        <w:spacing w:after="0"/>
+        <w:jc w:val="both"/>
+      </w:pPr>
+      <w:r>
         <w:t>Ý tưởng cho model gán ID tự build, sử dụng những biến này để so sánh 2 char trong 2 frame, có thể tùy biến:</w:t>
       </w:r>
     </w:p>

</xml_diff>